<commit_message>
fix: corrige cor vermelha e alinhamento da assinatura no template SDR
- Remove cor ff0000 (lowercase) do nome do representante na seção de assinatura
- Adiciona column break após LAQUILA para alinhar assinatura na mesma altura
- prepare_templates.py: regex case-insensitive para remover cores vermelhas FF0000/ff0000

Co-Authored-By: Claude Sonnet 4.6 <noreply@anthropic.com>
</commit_message>
<xml_diff>
--- a/templates/processed/sdr.docx
+++ b/templates/processed/sdr.docx
@@ -117,7 +117,6 @@
           <w:rFonts w:ascii="Book Antiqua" w:cs="Book Antiqua" w:eastAsia="Book Antiqua" w:hAnsi="Book Antiqua"/>
           <w:b w:val="1"/>
           <w:bCs w:val="1"/>
-          <w:color w:val="ff0000"/>
           <w:sz w:val="22"/>
           <w:szCs w:val="22"/>
           <w:rtl w:val="0"/>
@@ -136,7 +135,6 @@
       <w:r>
         <w:rPr>
           <w:rFonts w:ascii="Book Antiqua" w:cs="Book Antiqua" w:eastAsia="Book Antiqua" w:hAnsi="Book Antiqua"/>
-          <w:color w:val="ff0000"/>
           <w:sz w:val="22"/>
           <w:szCs w:val="22"/>
           <w:rtl w:val="0"/>
@@ -155,7 +153,6 @@
       <w:r>
         <w:rPr>
           <w:rFonts w:ascii="Book Antiqua" w:cs="Book Antiqua" w:eastAsia="Book Antiqua" w:hAnsi="Book Antiqua"/>
-          <w:color w:val="ff0000"/>
           <w:sz w:val="22"/>
           <w:szCs w:val="22"/>
           <w:rtl w:val="0"/>
@@ -174,7 +171,6 @@
       <w:r>
         <w:rPr>
           <w:rFonts w:ascii="Book Antiqua" w:cs="Book Antiqua" w:eastAsia="Book Antiqua" w:hAnsi="Book Antiqua"/>
-          <w:color w:val="ff0000"/>
           <w:sz w:val="22"/>
           <w:szCs w:val="22"/>
           <w:rtl w:val="0"/>
@@ -193,7 +189,6 @@
       <w:r>
         <w:rPr>
           <w:rFonts w:ascii="Book Antiqua" w:cs="Book Antiqua" w:eastAsia="Book Antiqua" w:hAnsi="Book Antiqua"/>
-          <w:color w:val="ff0000"/>
           <w:sz w:val="22"/>
           <w:szCs w:val="22"/>
           <w:rtl w:val="0"/>
@@ -213,7 +208,6 @@
         <w:r>
           <w:rPr>
             <w:rFonts w:ascii="Book Antiqua" w:cs="Book Antiqua" w:eastAsia="Book Antiqua" w:hAnsi="Book Antiqua"/>
-            <w:color w:val="ff0000"/>
             <w:sz w:val="22"/>
             <w:szCs w:val="22"/>
             <w:u w:val="single"/>
@@ -234,7 +228,6 @@
       <w:r>
         <w:rPr>
           <w:rFonts w:ascii="Book Antiqua" w:cs="Book Antiqua" w:eastAsia="Book Antiqua" w:hAnsi="Book Antiqua"/>
-          <w:color w:val="ff0000"/>
           <w:sz w:val="22"/>
           <w:szCs w:val="22"/>
           <w:rtl w:val="0"/>
@@ -2122,6 +2115,9 @@
           <w:rtl w:val="0"/>
         </w:rPr>
       </w:r>
+      <w:r>
+        <w:br w:type="column"/>
+      </w:r>
     </w:p>
     <w:p>
       <w:pPr>
@@ -2154,7 +2150,6 @@
         <w:jc w:val="center"/>
         <w:rPr>
           <w:rFonts w:ascii="Book Antiqua" w:cs="Book Antiqua" w:eastAsia="Book Antiqua" w:hAnsi="Book Antiqua"/>
-          <w:color w:val="ff0000"/>
           <w:sz w:val="22"/>
           <w:szCs w:val="22"/>
         </w:rPr>
@@ -2173,7 +2168,6 @@
           <w:rFonts w:ascii="Book Antiqua" w:cs="Book Antiqua" w:eastAsia="Book Antiqua" w:hAnsi="Book Antiqua"/>
           <w:b w:val="1"/>
           <w:bCs w:val="1"/>
-          <w:color w:val="ff0000"/>
           <w:sz w:val="22"/>
           <w:szCs w:val="22"/>
           <w:rtl w:val="0"/>

</xml_diff>